<commit_message>
UPDATE: tcpclient2 DATE: 2026-10-09 12:36:19
</commit_message>
<xml_diff>
--- a/Учеба 4 семестр/ОСИ/2 ЛАБ/Отчет_ЛР2.docx
+++ b/Учеба 4 семестр/ОСИ/2 ЛАБ/Отчет_ЛР2.docx
@@ -749,15 +749,6 @@
         </w:rPr>
         <w:t>2026г.</w:t>
       </w:r>
-    </w:p>
-    <w:p>
-      <w:pPr>
-        <w:spacing w:before="250"/>
-        <w:rPr>
-          <w:sz w:val="28"/>
-          <w:szCs w:val="28"/>
-        </w:rPr>
-      </w:pPr>
     </w:p>
     <w:p>
       <w:pPr>

</xml_diff>